<commit_message>
waardes toegevoegd in tabel rapport
</commit_message>
<xml_diff>
--- a/resources/templates/template_management_summary.docx
+++ b/resources/templates/template_management_summary.docx
@@ -348,13 +348,8 @@
       </w:r>
     </w:p>
     <w:p>
-      <w:proofErr w:type="spellStart"/>
       <w:r>
-        <w:t>Toetsniveau</w:t>
-      </w:r>
-      <w:proofErr w:type="spellEnd"/>
-      <w:r>
-        <w:t>:</w:t>
+        <w:t>Toetsniveau:</w:t>
       </w:r>
       <w:r>
         <w:t xml:space="preserve"> {{ </w:t>
@@ -433,16 +428,7 @@
         <w:t>Dikte zone 2:</w:t>
       </w:r>
       <w:r>
-        <w:t xml:space="preserve"> </w:t>
-      </w:r>
-      <w:r>
-        <w:t>{{ PLATE_THICKNESS</w:t>
-      </w:r>
-      <w:r>
-        <w:t>2</w:t>
-      </w:r>
-      <w:r>
-        <w:t xml:space="preserve"> }}</w:t>
+        <w:t xml:space="preserve"> {{ PLATE_THICKNESS2 }}</w:t>
       </w:r>
     </w:p>
     <w:p>
@@ -479,10 +465,10 @@
         <w:tblLook w:val="04A0" w:firstRow="1" w:lastRow="0" w:firstColumn="1" w:lastColumn="0" w:noHBand="0" w:noVBand="1"/>
       </w:tblPr>
       <w:tblGrid>
-        <w:gridCol w:w="2405"/>
-        <w:gridCol w:w="3119"/>
-        <w:gridCol w:w="1275"/>
-        <w:gridCol w:w="1701"/>
+        <w:gridCol w:w="2078"/>
+        <w:gridCol w:w="2402"/>
+        <w:gridCol w:w="2643"/>
+        <w:gridCol w:w="1377"/>
       </w:tblGrid>
       <w:tr>
         <w:tc>
@@ -585,7 +571,10 @@
           </w:tcPr>
           <w:p>
             <w:r>
-              <w:t>UGT – Combi</w:t>
+              <w:t xml:space="preserve">UGT – </w:t>
+            </w:r>
+            <w:r>
+              <w:t>Capaciteit</w:t>
             </w:r>
           </w:p>
         </w:tc>
@@ -593,13 +582,21 @@
           <w:tcPr>
             <w:tcW w:w="3119" w:type="dxa"/>
           </w:tcPr>
-          <w:p/>
+          <w:p>
+            <w:r>
+              <w:t>We moeten kijken of het haalbaar is om dit af te leiden uit de data</w:t>
+            </w:r>
+          </w:p>
         </w:tc>
         <w:tc>
           <w:tcPr>
             <w:tcW w:w="1275" w:type="dxa"/>
           </w:tcPr>
-          <w:p/>
+          <w:p>
+            <w:r>
+              <w:t>{{UC_CAPACITY}}</w:t>
+            </w:r>
+          </w:p>
         </w:tc>
         <w:tc>
           <w:tcPr>
@@ -629,7 +626,11 @@
           <w:tcPr>
             <w:tcW w:w="1275" w:type="dxa"/>
           </w:tcPr>
-          <w:p/>
+          <w:p>
+            <w:r>
+              <w:t>{{UC_SHEARFORCE}}</w:t>
+            </w:r>
+          </w:p>
         </w:tc>
         <w:tc>
           <w:tcPr>
@@ -645,18 +646,10 @@
           </w:tcPr>
           <w:p>
             <w:r>
-              <w:t xml:space="preserve">UGT – Max. moment </w:t>
-            </w:r>
-            <w:proofErr w:type="spellStart"/>
-            <w:r>
-              <w:t>MxD</w:t>
-            </w:r>
-            <w:proofErr w:type="spellEnd"/>
-            <w:r>
-              <w:t xml:space="preserve"> ond</w:t>
+              <w:t xml:space="preserve">UGT – </w:t>
             </w:r>
             <w:r>
-              <w:t>erzijde</w:t>
+              <w:t>Torsie</w:t>
             </w:r>
           </w:p>
         </w:tc>
@@ -670,7 +663,11 @@
           <w:tcPr>
             <w:tcW w:w="1275" w:type="dxa"/>
           </w:tcPr>
-          <w:p/>
+          <w:p>
+            <w:r>
+              <w:t>{{UC_TORSION}}</w:t>
+            </w:r>
+          </w:p>
         </w:tc>
         <w:tc>
           <w:tcPr>
@@ -686,10 +683,10 @@
           </w:tcPr>
           <w:p>
             <w:r>
-              <w:t>UGT – Max. moment MyD onde</w:t>
+              <w:t xml:space="preserve">UGT – </w:t>
             </w:r>
             <w:r>
-              <w:t>rzijde</w:t>
+              <w:t>Interactie</w:t>
             </w:r>
           </w:p>
         </w:tc>
@@ -703,7 +700,11 @@
           <w:tcPr>
             <w:tcW w:w="1275" w:type="dxa"/>
           </w:tcPr>
-          <w:p/>
+          <w:p>
+            <w:r>
+              <w:t>{{UC_INTERACTION}}</w:t>
+            </w:r>
+          </w:p>
         </w:tc>
         <w:tc>
           <w:tcPr>
@@ -733,7 +734,11 @@
           <w:tcPr>
             <w:tcW w:w="1275" w:type="dxa"/>
           </w:tcPr>
-          <w:p/>
+          <w:p>
+            <w:r>
+              <w:t>{{UC_CRACK_WIDTH}}</w:t>
+            </w:r>
+          </w:p>
         </w:tc>
         <w:tc>
           <w:tcPr>
@@ -744,6 +749,74 @@
               <w:t>Nee</w:t>
             </w:r>
           </w:p>
+        </w:tc>
+      </w:tr>
+      <w:tr>
+        <w:tc>
+          <w:tcPr>
+            <w:tcW w:w="2405" w:type="dxa"/>
+          </w:tcPr>
+          <w:p>
+            <w:r>
+              <w:t>Detaillering</w:t>
+            </w:r>
+          </w:p>
+        </w:tc>
+        <w:tc>
+          <w:tcPr>
+            <w:tcW w:w="3119" w:type="dxa"/>
+          </w:tcPr>
+          <w:p/>
+        </w:tc>
+        <w:tc>
+          <w:tcPr>
+            <w:tcW w:w="1275" w:type="dxa"/>
+          </w:tcPr>
+          <w:p>
+            <w:r>
+              <w:t>{{UC_DETAILING}}</w:t>
+            </w:r>
+          </w:p>
+        </w:tc>
+        <w:tc>
+          <w:tcPr>
+            <w:tcW w:w="1701" w:type="dxa"/>
+          </w:tcPr>
+          <w:p/>
+        </w:tc>
+      </w:tr>
+      <w:tr>
+        <w:tc>
+          <w:tcPr>
+            <w:tcW w:w="2405" w:type="dxa"/>
+          </w:tcPr>
+          <w:p>
+            <w:r>
+              <w:t>BGT – Spanningslimieten</w:t>
+            </w:r>
+          </w:p>
+        </w:tc>
+        <w:tc>
+          <w:tcPr>
+            <w:tcW w:w="3119" w:type="dxa"/>
+          </w:tcPr>
+          <w:p/>
+        </w:tc>
+        <w:tc>
+          <w:tcPr>
+            <w:tcW w:w="1275" w:type="dxa"/>
+          </w:tcPr>
+          <w:p>
+            <w:r>
+              <w:t>{{UC_STRESSLIMITATION}}</w:t>
+            </w:r>
+          </w:p>
+        </w:tc>
+        <w:tc>
+          <w:tcPr>
+            <w:tcW w:w="1701" w:type="dxa"/>
+          </w:tcPr>
+          <w:p/>
         </w:tc>
       </w:tr>
     </w:tbl>
@@ -6189,6 +6262,7 @@
     <w:rsid w:val="000A63DD"/>
     <w:rsid w:val="00106BC6"/>
     <w:rsid w:val="00132558"/>
+    <w:rsid w:val="0013615B"/>
     <w:rsid w:val="001500BB"/>
     <w:rsid w:val="001D7D73"/>
     <w:rsid w:val="001E16D5"/>
@@ -6258,6 +6332,7 @@
     <w:rsid w:val="00BC4648"/>
     <w:rsid w:val="00BD0D7F"/>
     <w:rsid w:val="00BF7A65"/>
+    <w:rsid w:val="00C0287B"/>
     <w:rsid w:val="00CC6B57"/>
     <w:rsid w:val="00D03F14"/>
     <w:rsid w:val="00D75347"/>
@@ -6739,58 +6814,6 @@
   <w:style w:type="paragraph" w:customStyle="1" w:styleId="F6F68E714AF54FC78798BF0334DD70EF">
     <w:name w:val="F6F68E714AF54FC78798BF0334DD70EF"/>
   </w:style>
-  <w:style w:type="paragraph" w:customStyle="1" w:styleId="7ADD7C6411E846478027BBA9B8C81307">
-    <w:name w:val="7ADD7C6411E846478027BBA9B8C81307"/>
-    <w:rsid w:val="005A568C"/>
-    <w:pPr>
-      <w:spacing w:line="278" w:lineRule="auto"/>
-    </w:pPr>
-    <w:rPr>
-      <w:kern w:val="2"/>
-      <w:sz w:val="24"/>
-      <w:szCs w:val="24"/>
-      <w14:ligatures w14:val="standardContextual"/>
-    </w:rPr>
-  </w:style>
-  <w:style w:type="paragraph" w:customStyle="1" w:styleId="8323BB8A300A47C983661243C0248F20">
-    <w:name w:val="8323BB8A300A47C983661243C0248F20"/>
-    <w:rsid w:val="005A568C"/>
-    <w:pPr>
-      <w:spacing w:line="278" w:lineRule="auto"/>
-    </w:pPr>
-    <w:rPr>
-      <w:kern w:val="2"/>
-      <w:sz w:val="24"/>
-      <w:szCs w:val="24"/>
-      <w14:ligatures w14:val="standardContextual"/>
-    </w:rPr>
-  </w:style>
-  <w:style w:type="paragraph" w:customStyle="1" w:styleId="9EED3D566FC04C938B4CF072C7A50940">
-    <w:name w:val="9EED3D566FC04C938B4CF072C7A50940"/>
-    <w:rsid w:val="005A568C"/>
-    <w:pPr>
-      <w:spacing w:line="278" w:lineRule="auto"/>
-    </w:pPr>
-    <w:rPr>
-      <w:kern w:val="2"/>
-      <w:sz w:val="24"/>
-      <w:szCs w:val="24"/>
-      <w14:ligatures w14:val="standardContextual"/>
-    </w:rPr>
-  </w:style>
-  <w:style w:type="paragraph" w:customStyle="1" w:styleId="55B445D736D747548D1876023E264024">
-    <w:name w:val="55B445D736D747548D1876023E264024"/>
-    <w:rsid w:val="005A568C"/>
-    <w:pPr>
-      <w:spacing w:line="278" w:lineRule="auto"/>
-    </w:pPr>
-    <w:rPr>
-      <w:kern w:val="2"/>
-      <w:sz w:val="24"/>
-      <w:szCs w:val="24"/>
-      <w14:ligatures w14:val="standardContextual"/>
-    </w:rPr>
-  </w:style>
 </w:styles>
 </file>
 
@@ -7087,6 +7110,18 @@
 </file>
 
 <file path=customXml/item1.xml><?xml version="1.0" encoding="utf-8"?>
+<p:properties xmlns:p="http://schemas.microsoft.com/office/2006/metadata/properties" xmlns:xsi="http://www.w3.org/2001/XMLSchema-instance" xmlns:pc="http://schemas.microsoft.com/office/infopath/2007/PartnerControls">
+  <documentManagement>
+    <_dlc_DocId xmlns="d65ad8cf-1a26-4b78-8568-cab1c6e30bc0">3PFU24XCCRSD-101280942-198</_dlc_DocId>
+    <_dlc_DocIdUrl xmlns="d65ad8cf-1a26-4b78-8568-cab1c6e30bc0">
+      <Url>https://hoofdstad.sharepoint.com/sites/msteams_c4b24b_981800-Parametrischontwerp/_layouts/15/DocIdRedir.aspx?ID=3PFU24XCCRSD-101280942-198</Url>
+      <Description>3PFU24XCCRSD-101280942-198</Description>
+    </_dlc_DocIdUrl>
+  </documentManagement>
+</p:properties>
+</file>
+
+<file path=customXml/item2.xml><?xml version="1.0" encoding="utf-8"?>
 <ct:contentTypeSchema xmlns:ct="http://schemas.microsoft.com/office/2006/metadata/contentType" xmlns:ma="http://schemas.microsoft.com/office/2006/metadata/properties/metaAttributes" ct:_="" ma:_="" ma:contentTypeName="Document" ma:contentTypeID="0x010100B73BE3BCC71F3A4E8CD24CB91351F44A" ma:contentTypeVersion="8" ma:contentTypeDescription="Een nieuw document maken." ma:contentTypeScope="" ma:versionID="06dec9c8fa125fabaabf8da99c27458d">
   <xsd:schema xmlns:xsd="http://www.w3.org/2001/XMLSchema" xmlns:xs="http://www.w3.org/2001/XMLSchema" xmlns:p="http://schemas.microsoft.com/office/2006/metadata/properties" xmlns:ns2="dfff6750-5bef-45e3-997e-90b9c7313c58" xmlns:ns3="d65ad8cf-1a26-4b78-8568-cab1c6e30bc0" targetNamespace="http://schemas.microsoft.com/office/2006/metadata/properties" ma:root="true" ma:fieldsID="f0f4be6480e42c266f3ad98a1991cf0a" ns2:_="" ns3:_="">
     <xsd:import namespace="dfff6750-5bef-45e3-997e-90b9c7313c58"/>
@@ -7260,32 +7295,7 @@
 </ct:contentTypeSchema>
 </file>
 
-<file path=customXml/item2.xml><?xml version="1.0" encoding="utf-8"?>
-<p:properties xmlns:p="http://schemas.microsoft.com/office/2006/metadata/properties" xmlns:xsi="http://www.w3.org/2001/XMLSchema-instance" xmlns:pc="http://schemas.microsoft.com/office/infopath/2007/PartnerControls">
-  <documentManagement>
-    <_dlc_DocId xmlns="d65ad8cf-1a26-4b78-8568-cab1c6e30bc0">3PFU24XCCRSD-101280942-198</_dlc_DocId>
-    <_dlc_DocIdUrl xmlns="d65ad8cf-1a26-4b78-8568-cab1c6e30bc0">
-      <Url>https://hoofdstad.sharepoint.com/sites/msteams_c4b24b_981800-Parametrischontwerp/_layouts/15/DocIdRedir.aspx?ID=3PFU24XCCRSD-101280942-198</Url>
-      <Description>3PFU24XCCRSD-101280942-198</Description>
-    </_dlc_DocIdUrl>
-  </documentManagement>
-</p:properties>
-</file>
-
 <file path=customXml/item3.xml><?xml version="1.0" encoding="utf-8"?>
-<b:Sources xmlns:b="http://schemas.openxmlformats.org/officeDocument/2006/bibliography" xmlns="http://schemas.openxmlformats.org/officeDocument/2006/bibliography" SelectedStyle="\TURABIAN.XSL" StyleName="Turabian"/>
-</file>
-
-<file path=customXml/item4.xml><?xml version="1.0" encoding="utf-8"?>
-<?mso-contentType ?>
-<FormTemplates xmlns="http://schemas.microsoft.com/sharepoint/v3/contenttype/forms">
-  <Display>DocumentLibraryForm</Display>
-  <Edit>DocumentLibraryForm</Edit>
-  <New>DocumentLibraryForm</New>
-</FormTemplates>
-</file>
-
-<file path=customXml/item5.xml><?xml version="1.0" encoding="utf-8"?>
 <?mso-contentType ?>
 <spe:Receivers xmlns:spe="http://schemas.microsoft.com/sharepoint/events">
   <Receiver>
@@ -7335,7 +7345,30 @@
 </spe:Receivers>
 </file>
 
+<file path=customXml/item4.xml><?xml version="1.0" encoding="utf-8"?>
+<?mso-contentType ?>
+<FormTemplates xmlns="http://schemas.microsoft.com/sharepoint/v3/contenttype/forms">
+  <Display>DocumentLibraryForm</Display>
+  <Edit>DocumentLibraryForm</Edit>
+  <New>DocumentLibraryForm</New>
+</FormTemplates>
+</file>
+
+<file path=customXml/item5.xml><?xml version="1.0" encoding="utf-8"?>
+<b:Sources xmlns:b="http://schemas.openxmlformats.org/officeDocument/2006/bibliography" xmlns="http://schemas.openxmlformats.org/officeDocument/2006/bibliography" SelectedStyle="\TURABIAN.XSL" StyleName="Turabian"/>
+</file>
+
 <file path=customXml/itemProps1.xml><?xml version="1.0" encoding="utf-8"?>
+<ds:datastoreItem xmlns:ds="http://schemas.openxmlformats.org/officeDocument/2006/customXml" ds:itemID="{37BA5701-AB9F-4A15-891C-2B94F7322D1C}">
+  <ds:schemaRefs>
+    <ds:schemaRef ds:uri="http://schemas.microsoft.com/office/2006/metadata/properties"/>
+    <ds:schemaRef ds:uri="http://schemas.microsoft.com/office/infopath/2007/PartnerControls"/>
+    <ds:schemaRef ds:uri="d65ad8cf-1a26-4b78-8568-cab1c6e30bc0"/>
+  </ds:schemaRefs>
+</ds:datastoreItem>
+</file>
+
+<file path=customXml/itemProps2.xml><?xml version="1.0" encoding="utf-8"?>
 <ds:datastoreItem xmlns:ds="http://schemas.openxmlformats.org/officeDocument/2006/customXml" ds:itemID="{DB59B19B-D3CE-4A9D-A176-26F18C7D1764}">
   <ds:schemaRefs>
     <ds:schemaRef ds:uri="http://schemas.microsoft.com/office/2006/metadata/contentType"/>
@@ -7354,20 +7387,10 @@
 </ds:datastoreItem>
 </file>
 
-<file path=customXml/itemProps2.xml><?xml version="1.0" encoding="utf-8"?>
-<ds:datastoreItem xmlns:ds="http://schemas.openxmlformats.org/officeDocument/2006/customXml" ds:itemID="{37BA5701-AB9F-4A15-891C-2B94F7322D1C}">
+<file path=customXml/itemProps3.xml><?xml version="1.0" encoding="utf-8"?>
+<ds:datastoreItem xmlns:ds="http://schemas.openxmlformats.org/officeDocument/2006/customXml" ds:itemID="{D20ADB69-FCEC-4643-AA39-D35EED5C1943}">
   <ds:schemaRefs>
-    <ds:schemaRef ds:uri="http://schemas.microsoft.com/office/2006/metadata/properties"/>
-    <ds:schemaRef ds:uri="http://schemas.microsoft.com/office/infopath/2007/PartnerControls"/>
-    <ds:schemaRef ds:uri="d65ad8cf-1a26-4b78-8568-cab1c6e30bc0"/>
-  </ds:schemaRefs>
-</ds:datastoreItem>
-</file>
-
-<file path=customXml/itemProps3.xml><?xml version="1.0" encoding="utf-8"?>
-<ds:datastoreItem xmlns:ds="http://schemas.openxmlformats.org/officeDocument/2006/customXml" ds:itemID="{A3C81CB0-9EDB-4CE9-96DA-DE711A174FDD}">
-  <ds:schemaRefs>
-    <ds:schemaRef ds:uri="http://schemas.openxmlformats.org/officeDocument/2006/bibliography"/>
+    <ds:schemaRef ds:uri="http://schemas.microsoft.com/sharepoint/events"/>
   </ds:schemaRefs>
 </ds:datastoreItem>
 </file>
@@ -7381,9 +7404,9 @@
 </file>
 
 <file path=customXml/itemProps5.xml><?xml version="1.0" encoding="utf-8"?>
-<ds:datastoreItem xmlns:ds="http://schemas.openxmlformats.org/officeDocument/2006/customXml" ds:itemID="{D20ADB69-FCEC-4643-AA39-D35EED5C1943}">
+<ds:datastoreItem xmlns:ds="http://schemas.openxmlformats.org/officeDocument/2006/customXml" ds:itemID="{A3C81CB0-9EDB-4CE9-96DA-DE711A174FDD}">
   <ds:schemaRefs>
-    <ds:schemaRef ds:uri="http://schemas.microsoft.com/sharepoint/events"/>
+    <ds:schemaRef ds:uri="http://schemas.openxmlformats.org/officeDocument/2006/bibliography"/>
   </ds:schemaRefs>
 </ds:datastoreItem>
 </file>
</xml_diff>

<commit_message>
ruff en mypy fixes
</commit_message>
<xml_diff>
--- a/resources/templates/template_management_summary.docx
+++ b/resources/templates/template_management_summary.docx
@@ -348,8 +348,13 @@
       </w:r>
     </w:p>
     <w:p>
+      <w:proofErr w:type="spellStart"/>
       <w:r>
-        <w:t>Toetsniveau:</w:t>
+        <w:t>Toetsniveau</w:t>
+      </w:r>
+      <w:proofErr w:type="spellEnd"/>
+      <w:r>
+        <w:t>:</w:t>
       </w:r>
       <w:r>
         <w:t xml:space="preserve"> {{ </w:t>
@@ -582,11 +587,7 @@
           <w:tcPr>
             <w:tcW w:w="3119" w:type="dxa"/>
           </w:tcPr>
-          <w:p>
-            <w:r>
-              <w:t>We moeten kijken of het haalbaar is om dit af te leiden uit de data</w:t>
-            </w:r>
-          </w:p>
+          <w:p/>
         </w:tc>
         <w:tc>
           <w:tcPr>
@@ -6314,6 +6315,7 @@
     <w:rsid w:val="0090380D"/>
     <w:rsid w:val="0091168E"/>
     <w:rsid w:val="00926AC5"/>
+    <w:rsid w:val="00941F54"/>
     <w:rsid w:val="00951FB2"/>
     <w:rsid w:val="00967855"/>
     <w:rsid w:val="009A4EA4"/>
@@ -6332,7 +6334,6 @@
     <w:rsid w:val="00BC4648"/>
     <w:rsid w:val="00BD0D7F"/>
     <w:rsid w:val="00BF7A65"/>
-    <w:rsid w:val="00C0287B"/>
     <w:rsid w:val="00CC6B57"/>
     <w:rsid w:val="00D03F14"/>
     <w:rsid w:val="00D75347"/>

</xml_diff>